<commit_message>
Fix two recompute-wrong figures; back no-show detection timing with a formula
- No-show reporting baseline was asserted as ~2%; the real value is 16.5% of
  no-show events logged within 1h of shift start (194/1,177). Corrected in the
  PDF and Word proposal (metric now reads 16% -> 50%), and added a live
  detection-timing block to Calc_ShiftOutcomes so the figure is auditable.
- Take per rescued shift was ~5 (the all-shifts average); a rescued (late/NCNS)
  shift averages 08 gross, so the take is ~8. Corrected in both documents.

Co-Authored-By: Claude Fable 5 <noreply@anthropic.com>
Claude-Session: https://claude.ai/code/session_01UJYSbJP9zv2zm8gy8aUBbK
</commit_message>
<xml_diff>
--- a/deliverables/Clipboard_Case_Proposal.docx
+++ b/deliverables/Clipboard_Case_Proposal.docx
@@ -1712,7 +1712,7 @@
           <w:sz w:val="21"/>
           <w:szCs w:val="21"/>
         </w:rPr>
-        <w:t xml:space="preserve"> A late cancel already lands in our logs the instant it happens, but nothing operational fires off it today. A no-show we hear about a median of 35 hours late. So on the facility side I will add a one-tap "worker hasn't shown up" button that pops up automatically 15 minutes after the shift starts if the worker has not confirmed arrival in the app. The target: late cancels kick off the loop in under 5 minutes, and half of no-shows get reported within an hour of the start time, against roughly 2% today.</w:t>
+        <w:t xml:space="preserve"> A late cancel already lands in our logs the instant it happens, but nothing operational fires off it today. A no-show we hear about a median of 35 hours late. So on the facility side I will add a one-tap "worker hasn't shown up" button that pops up automatically 15 minutes after the shift starts if the worker has not confirmed arrival in the app. The target: late cancels kick off the loop in under 5 minutes, and half of no-shows get reported within an hour of the start time, up from about 16% today.</w:t>
       </w:r>
     </w:p>
     <w:p>
@@ -2532,7 +2532,7 @@
                 <w:sz w:val="17"/>
                 <w:szCs w:val="17"/>
               </w:rPr>
-              <w:t xml:space="preserve">~2%</w:t>
+              <w:t xml:space="preserve">~16%</w:t>
             </w:r>
           </w:p>
         </w:tc>
@@ -3309,7 +3309,7 @@
           <w:sz w:val="21"/>
           <w:szCs w:val="21"/>
         </w:rPr>
-        <w:t xml:space="preserve">If the pipeline is clearly working, offers going out in minutes, but conversion still lags the target, then the problem is incentive rather than speed, and the next lever is a small same-day bonus paid for out of the roughly $75 we take on each rescued shift. I am leaving that spend out of this proposal on purpose. It is the obvious second iteration, and the data will tell us if we need it.</w:t>
+        <w:t xml:space="preserve">If the pipeline is clearly working, offers going out in minutes, but conversion still lags the target, then the problem is incentive rather than speed, and the next lever is a small same-day bonus paid for out of the roughly $68 we take on each rescued shift. I am leaving that spend out of this proposal on purpose. It is the obvious second iteration, and the data will tell us if we need it.</w:t>
       </w:r>
     </w:p>
     <w:p>

</xml_diff>